<commit_message>
Experiments folder structure created
</commit_message>
<xml_diff>
--- a/ML on MCU Project Ideas.docx
+++ b/ML on MCU Project Ideas.docx
@@ -294,13 +294,26 @@
         </w:rPr>
         <w:t>Maybe we are understanding the goal/expectations of the project not correctly, but I see it difficult to beat Analog Devices</w:t>
       </w:r>
+      <w:r>
+        <w:rPr>
+          <w:color w:val="A02B93" w:themeColor="accent5"/>
+        </w:rPr>
+        <w:t>. In any case, we would reproduce a lot of work that was already done.</w:t>
+      </w:r>
     </w:p>
     <w:p>
       <w:pPr>
-        <w:rPr>
-          <w:color w:val="A02B93" w:themeColor="accent5"/>
-        </w:rPr>
-      </w:pPr>
+        <w:jc w:val="both"/>
+        <w:rPr>
+          <w:color w:val="A02B93" w:themeColor="accent5"/>
+        </w:rPr>
+      </w:pPr>
+      <w:r>
+        <w:rPr>
+          <w:color w:val="A02B93" w:themeColor="accent5"/>
+        </w:rPr>
+        <w:t xml:space="preserve">Is the real purpose of the project to take the current DS-CNN and </w:t>
+      </w:r>
     </w:p>
     <w:p>
       <w:pPr>

</xml_diff>